<commit_message>
add MANIPULAÇOES LOJA INFORMATICA
</commit_message>
<xml_diff>
--- a/BANCO DE DADOS -- AVALIAÇÃO 2 -- ANDREY GABRIEL BEN e LUCAS NEVES.docx
+++ b/BANCO DE DADOS -- AVALIAÇÃO 2 -- ANDREY GABRIEL BEN e LUCAS NEVES.docx
@@ -210,14 +210,44 @@
           <w:sz w:val="22"/>
           <w:szCs w:val="22"/>
         </w:rPr>
-        <w:t>Para solucionar esses problemas, desenvolvemos um modelo de banco de dados relacional que garante a integridade das informações através de restrições de chaves (Primary e Foreign Keys). O sistema centraliza o cadastro de clientes, fornecedores e o ciclo de vida das Ordens de Serviço (chamados), permitindo uma gestão padronizada que elimina a redundância de dados e assegura a rastreabilidade completa de cada manutenção realizada e cada venda concluída</w:t>
-      </w:r>
+        <w:t xml:space="preserve">Para solucionar esses problemas, desenvolvemos um modelo de banco de dados relacional que garante a integridade das informações através de restrições de chaves (Primary e </w:t>
+      </w:r>
+      <w:proofErr w:type="spellStart"/>
       <w:r>
         <w:rPr>
           <w:sz w:val="22"/>
           <w:szCs w:val="22"/>
         </w:rPr>
+        <w:t>Foreign</w:t>
+      </w:r>
+      <w:proofErr w:type="spellEnd"/>
+      <w:r>
+        <w:rPr>
+          <w:sz w:val="22"/>
+          <w:szCs w:val="22"/>
+        </w:rPr>
+        <w:t xml:space="preserve"> Keys). O sistema centraliza o cadastro de clientes, fornecedores e o ciclo de vida das Ordens de Serviço (chamados), permitindo uma gestão padronizada que elimina a redundância de dados e assegura a rastreabilidade completa de cada manutenção realizada e cada venda concluída</w:t>
+      </w:r>
+      <w:r>
+        <w:rPr>
+          <w:sz w:val="22"/>
+          <w:szCs w:val="22"/>
+        </w:rPr>
         <w:t>.</w:t>
+      </w:r>
+      <w:r>
+        <w:rPr>
+          <w:sz w:val="22"/>
+          <w:szCs w:val="22"/>
+        </w:rPr>
+        <w:t xml:space="preserve"> </w:t>
+      </w:r>
+      <w:r>
+        <w:rPr>
+          <w:sz w:val="22"/>
+          <w:szCs w:val="22"/>
+        </w:rPr>
+        <w:t>ASSISTÊNCIA TÉCNICA</w:t>
       </w:r>
     </w:p>
     <w:p>
@@ -417,7 +447,33 @@
         <w:ind w:left="567"/>
       </w:pPr>
       <w:r>
-        <w:t>Os arquivos estão disponíveis em anexo ao trabalho ou no repositório:</w:t>
+        <w:t>Os arquivos estão disponíveis em anexo ao trabalho ou no repositório</w:t>
+      </w:r>
+      <w:r>
+        <w:t xml:space="preserve"> do </w:t>
+      </w:r>
+      <w:proofErr w:type="spellStart"/>
+      <w:r>
+        <w:t>Github</w:t>
+      </w:r>
+      <w:proofErr w:type="spellEnd"/>
+      <w:r>
+        <w:t xml:space="preserve">, só clicar </w:t>
+      </w:r>
+      <w:hyperlink r:id="rId7" w:history="1">
+        <w:r>
+          <w:rPr>
+            <w:rStyle w:val="Hyperlink"/>
+            <w:color w:val="002060"/>
+          </w:rPr>
+          <w:t>AQUI</w:t>
+        </w:r>
+      </w:hyperlink>
+      <w:r>
+        <w:rPr>
+          <w:color w:val="002060"/>
+        </w:rPr>
+        <w:t>.</w:t>
       </w:r>
     </w:p>
     <w:p>
@@ -1476,6 +1532,41 @@
       <w:spacing w:val="5"/>
     </w:rPr>
   </w:style>
+  <w:style w:type="character" w:styleId="Hyperlink">
+    <w:name w:val="Hyperlink"/>
+    <w:basedOn w:val="Fontepargpadro"/>
+    <w:uiPriority w:val="99"/>
+    <w:unhideWhenUsed/>
+    <w:rsid w:val="00001183"/>
+    <w:rPr>
+      <w:color w:val="467886" w:themeColor="hyperlink"/>
+      <w:u w:val="single"/>
+    </w:rPr>
+  </w:style>
+  <w:style w:type="character" w:styleId="MenoPendente">
+    <w:name w:val="Unresolved Mention"/>
+    <w:basedOn w:val="Fontepargpadro"/>
+    <w:uiPriority w:val="99"/>
+    <w:semiHidden/>
+    <w:unhideWhenUsed/>
+    <w:rsid w:val="00001183"/>
+    <w:rPr>
+      <w:color w:val="605E5C"/>
+      <w:shd w:val="clear" w:color="auto" w:fill="E1DFDD"/>
+    </w:rPr>
+  </w:style>
+  <w:style w:type="character" w:styleId="HiperlinkVisitado">
+    <w:name w:val="FollowedHyperlink"/>
+    <w:basedOn w:val="Fontepargpadro"/>
+    <w:uiPriority w:val="99"/>
+    <w:semiHidden/>
+    <w:unhideWhenUsed/>
+    <w:rsid w:val="00001183"/>
+    <w:rPr>
+      <w:color w:val="96607D" w:themeColor="followedHyperlink"/>
+      <w:u w:val="single"/>
+    </w:rPr>
+  </w:style>
 </w:styles>
 </file>
 

</xml_diff>